<commit_message>
Add prompt comparison to the Beszel summary
</commit_message>
<xml_diff>
--- a/del-a-kodbasanalys/sammanfattning.docx
+++ b/del-a-kodbasanalys/sammanfattning.docx
@@ -23,7 +23,7 @@
         <w:spacing w:after="160" w:line="300"/>
       </w:pPr>
       <w:r>
-        <w:t xml:space="preserve">Beszel övervakar servrar. Agenten samlar in CPU, minne, disk, nätverk, temperaturer, GPU, containrar, SMART, ZFS och systemd, hubben sparar historiken, ritar grafer och skickar larm. Det riktar sig till hemmalabb och mindre driftteam som inte vill sätta upp Prometheus och Grafana. MIT-licens och i praktiken en enda maintainer, henrygd står bakom ungefär tre fjärdedelar av commitsen. Vi jobbar i en fork av version 0.21.0.</w:t>
+        <w:t xml:space="preserve">Beszel övervakar servrar. Agenten samlar in det mesta, från CPU och disk till containrar och SMART-data, och hubben sparar historiken, ritar grafer och skickar larm. Det riktar sig till hemmalabb och mindre driftteam som inte vill sätta upp Prometheus och Grafana. MIT-licens och i praktiken en enda maintainer, henrygd står bakom ungefär tre fjärdedelar av commitsen. Vi jobbar i en fork av version 0.21.0.</w:t>
       </w:r>
     </w:p>
     <w:p>
@@ -39,7 +39,7 @@
         <w:spacing w:after="160" w:line="300"/>
       </w:pPr>
       <w:r>
-        <w:t xml:space="preserve">Allt ligger i en Go-modul som ger två binärer. Agenten i </w:t>
+        <w:t xml:space="preserve">Koden är en Go-modul och den bygger två binärer. Agenten i </w:t>
       </w:r>
       <w:r>
         <w:rPr>
@@ -72,7 +72,7 @@
         <w:t xml:space="preserve">go:embed</w:t>
       </w:r>
       <w:r>
-        <w:t xml:space="preserve">, så det man driftsätter är en enda fil.</w:t>
+        <w:t xml:space="preserve">, så det man driftsätter är bara en fil.</w:t>
       </w:r>
     </w:p>
     <w:p>
@@ -104,15 +104,15 @@
         <w:spacing w:after="160" w:line="300"/>
       </w:pPr>
       <w:r>
-        <w:t xml:space="preserve">PocketBase är hela backenden i hubben: databas, REST, realtime, inloggning, behörighetsregler, cron och adminpanel. Man får mycket gratis, men versionen är fortfarande 0.x och domänlogiken anropar den direkt överallt, så ett byte är inte realistiskt och uppgraderingar kan göra ont.</w:t>
-      </w:r>
-    </w:p>
-    <w:p>
-      <w:pPr>
-        <w:spacing w:after="160" w:line="300"/>
-      </w:pPr>
-      <w:r>
-        <w:t xml:space="preserve">gopsutil står för det mesta av insamlingen på agenten och gör att samma kod fungerar på Linux, Windows, macOS och FreeBSD. På Linux läser projektet redan </w:t>
+        <w:t xml:space="preserve">PocketBase gör i princip allt i hubben, från databas och inloggning till cron och adminpanel. Domänlogiken anropar den direkt överallt, så den går inte att byta ut. Och den är fortfarande 0.x, så uppgraderingar kan göra ont.</w:t>
+      </w:r>
+    </w:p>
+    <w:p>
+      <w:pPr>
+        <w:spacing w:after="160" w:line="300"/>
+      </w:pPr>
+      <w:r>
+        <w:t xml:space="preserve">gopsutil sköter det mesta av insamlingen på agenten och är anledningen till att samma kod går på Linux, Windows, macOS och FreeBSD. På Linux läser de redan </w:t>
       </w:r>
       <w:r>
         <w:rPr>
@@ -186,7 +186,7 @@
         <w:t xml:space="preserve">x/crypto/ssh</w:t>
       </w:r>
       <w:r>
-        <w:t xml:space="preserve">. Biblioteken går att byta ut. Formatet går inte att ändra utan vidare, eftersom gamla agenter som redan är installerade måste fortsätta fungera.</w:t>
+        <w:t xml:space="preserve">. Biblioteken kan man byta, men formatet sitter fast eftersom agenter som redan är installerade måste fortsätta fungera.</w:t>
       </w:r>
     </w:p>
     <w:p>
@@ -213,7 +213,7 @@
         <w:t xml:space="preserve">createRecords</w:t>
       </w:r>
       <w:r>
-        <w:t xml:space="preserve">, och den regeln står inte nedskriven någonstans. En statusändring från adminpanelen kan också ge larm. Jag blev också förvånad över att det finns mer testkod än produktionskod i Go, runt 39 000 mot 32 000 rader, medan inget CI-workflow kör </w:t>
+        <w:t xml:space="preserve">, och den regeln står inte nedskriven någonstans. En statusändring från adminpanelen kan också ge larm. Sen finns det mer testkod än produktionskod i Go, runt 39 000 mot 32 000 rader, men inget CI-workflow kör </w:t>
       </w:r>
       <w:r>
         <w:rPr>
@@ -232,6 +232,60 @@
         <w:pStyle w:val="Heading2"/>
       </w:pPr>
       <w:r>
+        <w:t xml:space="preserve">Skillnaden mellan promptarna</w:t>
+      </w:r>
+    </w:p>
+    <w:p>
+      <w:pPr>
+        <w:spacing w:after="160" w:line="300"/>
+      </w:pPr>
+      <w:r>
+        <w:t xml:space="preserve">Första prompten skrev jag på några sekunder och den gav </w:t>
+      </w:r>
+      <w:r>
+        <w:rPr>
+          <w:rFonts w:ascii="Consolas" w:cs="Consolas" w:eastAsia="Consolas" w:hAnsi="Consolas"/>
+          <w:sz w:val="20"/>
+          <w:szCs w:val="20"/>
+        </w:rPr>
+        <w:t xml:space="preserve">beszel-oversikt-detailed.md</w:t>
+      </w:r>
+      <w:r>
+        <w:t xml:space="preserve">, knappt 1 800 ord. Agenten fick välja upplägg själv och det blev en genomgång av vad projektet är, hur det fungerar och vad som är bra och dåligt. Filer nämns här och där, men det framgår inte vad den faktiskt har läst och vad den gissar. Jag bad den installera det som saknades, så den byggde projektet och körde testerna. Sex agenttester gick inte igenom på min maskin.</w:t>
+      </w:r>
+    </w:p>
+    <w:p>
+      <w:pPr>
+        <w:spacing w:after="160" w:line="300"/>
+      </w:pPr>
+      <w:r>
+        <w:t xml:space="preserve">Andra prompten blev betydligt längre, med frågor för varje område och krav på att den skulle skilja på bekräftat och misstänkt. Svaret, </w:t>
+      </w:r>
+      <w:r>
+        <w:rPr>
+          <w:rFonts w:ascii="Consolas" w:cs="Consolas" w:eastAsia="Consolas" w:hAnsi="Consolas"/>
+          <w:sz w:val="20"/>
+          <w:szCs w:val="20"/>
+        </w:rPr>
+        <w:t xml:space="preserve">TEKNISK-ANALYS.md</w:t>
+      </w:r>
+      <w:r>
+        <w:t xml:space="preserve">, är drygt 4 000 ord och följer exakt min ordning. Den hänvisar till filer och rader runt 125 gånger mot knappt 30 i den första, och varje problem har en säkerhetsgrad. Den körde ingenting eftersom Go inte fanns installerat, allt kommer från att läsa koden.</w:t>
+      </w:r>
+    </w:p>
+    <w:p>
+      <w:pPr>
+        <w:spacing w:after="160" w:line="300"/>
+      </w:pPr>
+      <w:r>
+        <w:t xml:space="preserve">Den andra var lättare att granska, men det viktigaste säkerhetsfyndet, att hubben inte kollar agentens SSH host key, kom bara i den första.</w:t>
+      </w:r>
+    </w:p>
+    <w:p>
+      <w:pPr>
+        <w:pStyle w:val="Heading2"/>
+      </w:pPr>
+      <w:r>
         <w:t xml:space="preserve">Om agentens analys</w:t>
       </w:r>
     </w:p>
@@ -262,7 +316,7 @@
         <w:t xml:space="preserve">TEKNISK-ANALYS.md</w:t>
       </w:r>
       <w:r>
-        <w:t xml:space="preserve">. Bilden av arkitekturen och beroendena stämde, och när jag stickprovade detaljerna höll de flesta. CI kör inga tester, </w:t>
+        <w:t xml:space="preserve">. Arkitekturen och beroendena stämde och de flesta stickproven höll. CI kör inga tester, </w:t>
       </w:r>
       <w:r>
         <w:rPr>
@@ -306,7 +360,15 @@
         <w:t xml:space="preserve">GetSSHKey</w:t>
       </w:r>
       <w:r>
-        <w:t xml:space="preserve"> läser nyckelfilen vid varje anslutning, och väntetiden innan SSH-fallback är 11 sekunder. Retentionstiderna stämde också. Den längre analysen räknade däremot autentiseringen mellan hub och agent som något som inte är ett problem, trots att hubben använder </w:t>
+        <w:t xml:space="preserve"> läser nyckelfilen vid varje anslutning, och väntetiden innan SSH-fallback är 11 sekunder. Retentionstiderna stämde också.</w:t>
+      </w:r>
+    </w:p>
+    <w:p>
+      <w:pPr>
+        <w:spacing w:after="160" w:line="300"/>
+      </w:pPr>
+      <w:r>
+        <w:t xml:space="preserve">Den längre analysen räknade däremot autentiseringen mellan hub och agent som något som inte är ett problem, trots att hubben använder </w:t>
       </w:r>
       <w:r>
         <w:rPr>
@@ -350,7 +412,15 @@
         <w:t xml:space="preserve">test</w:t>
       </w:r>
       <w:r>
-        <w:t xml:space="preserve">. Själv kollade jag </w:t>
+        <w:t xml:space="preserve">.</w:t>
+      </w:r>
+    </w:p>
+    <w:p>
+      <w:pPr>
+        <w:spacing w:after="160" w:line="300"/>
+      </w:pPr>
+      <w:r>
+        <w:t xml:space="preserve">Själv gick jag igenom </w:t>
       </w:r>
       <w:r>
         <w:rPr>
@@ -372,7 +442,7 @@
         <w:t xml:space="preserve">embed.go</w:t>
       </w:r>
       <w:r>
-        <w:t xml:space="preserve">, alla workflows, SSH-konfigurationen på hub- och agentsidan, signer-fältet, retentionstabellen, trusted header-logiken i </w:t>
+        <w:t xml:space="preserve"> och alla workflows. Sen kollade jag SSH-koden på båda sidor och ett par enskilda saker, bland annat trusted header-logiken i </w:t>
       </w:r>
       <w:r>
         <w:rPr>
@@ -383,7 +453,7 @@
         <w:t xml:space="preserve">api.go</w:t>
       </w:r>
       <w:r>
-        <w:t xml:space="preserve"> och commit-historiken. Kvar att göra är en körning med </w:t>
+        <w:t xml:space="preserve">. Jag har inte hunnit köra </w:t>
       </w:r>
       <w:r>
         <w:rPr>
@@ -405,7 +475,7 @@
         <w:t xml:space="preserve">WsConn</w:t>
       </w:r>
       <w:r>
-        <w:t xml:space="preserve"> finns på riktigt, och en jämförelse mot upstream.</w:t>
+        <w:t xml:space="preserve"> finns på riktigt, och inte jämfört mot upstream heller.</w:t>
       </w:r>
     </w:p>
     <w:sectPr>

</xml_diff>